<commit_message>
chore: optimize docx report and chart resolutions under 2048 KB
</commit_message>
<xml_diff>
--- a/Advanced_Logistics_Data_Analysis_Report.docx
+++ b/Advanced_Logistics_Data_Analysis_Report.docx
@@ -121,7 +121,7 @@
                 <w:color w:val="475569"/>
                 <w:sz w:val="17"/>
               </w:rPr>
-              <w:t>Publication Date: October 05, 2026</w:t>
+              <w:t>Publication Date: October 06, 2026</w:t>
             </w:r>
           </w:p>
         </w:tc>
@@ -5296,7 +5296,7 @@
       <w:r>
         <w:drawing>
           <wp:inline xmlns:a="http://schemas.openxmlformats.org/drawingml/2006/main" xmlns:pic="http://schemas.openxmlformats.org/drawingml/2006/picture">
-            <wp:extent cx="5669280" cy="3401568"/>
+            <wp:extent cx="5669280" cy="3275584"/>
             <wp:docPr id="1" name="Picture 1"/>
             <wp:cNvGraphicFramePr>
               <a:graphicFrameLocks noChangeAspect="1"/>
@@ -5317,7 +5317,7 @@
                   <pic:spPr>
                     <a:xfrm>
                       <a:off x="0" y="0"/>
-                      <a:ext cx="5669280" cy="3401568"/>
+                      <a:ext cx="5669280" cy="3275584"/>
                     </a:xfrm>
                     <a:prstGeom prst="rect"/>
                   </pic:spPr>
@@ -5438,7 +5438,7 @@
       <w:r>
         <w:drawing>
           <wp:inline xmlns:a="http://schemas.openxmlformats.org/drawingml/2006/main" xmlns:pic="http://schemas.openxmlformats.org/drawingml/2006/picture">
-            <wp:extent cx="5669280" cy="2398542"/>
+            <wp:extent cx="5669280" cy="2473868"/>
             <wp:docPr id="2" name="Picture 2"/>
             <wp:cNvGraphicFramePr>
               <a:graphicFrameLocks noChangeAspect="1"/>
@@ -5459,7 +5459,7 @@
                   <pic:spPr>
                     <a:xfrm>
                       <a:off x="0" y="0"/>
-                      <a:ext cx="5669280" cy="2398542"/>
+                      <a:ext cx="5669280" cy="2473868"/>
                     </a:xfrm>
                     <a:prstGeom prst="rect"/>
                   </pic:spPr>
@@ -5580,7 +5580,7 @@
       <w:r>
         <w:drawing>
           <wp:inline xmlns:a="http://schemas.openxmlformats.org/drawingml/2006/main" xmlns:pic="http://schemas.openxmlformats.org/drawingml/2006/picture">
-            <wp:extent cx="5669280" cy="3118104"/>
+            <wp:extent cx="5669280" cy="3023616"/>
             <wp:docPr id="3" name="Picture 3"/>
             <wp:cNvGraphicFramePr>
               <a:graphicFrameLocks noChangeAspect="1"/>
@@ -5601,7 +5601,7 @@
                   <pic:spPr>
                     <a:xfrm>
                       <a:off x="0" y="0"/>
-                      <a:ext cx="5669280" cy="3118104"/>
+                      <a:ext cx="5669280" cy="3023616"/>
                     </a:xfrm>
                     <a:prstGeom prst="rect"/>
                   </pic:spPr>
@@ -5728,7 +5728,7 @@
       <w:r>
         <w:drawing>
           <wp:inline xmlns:a="http://schemas.openxmlformats.org/drawingml/2006/main" xmlns:pic="http://schemas.openxmlformats.org/drawingml/2006/picture">
-            <wp:extent cx="5669280" cy="3118104"/>
+            <wp:extent cx="5669280" cy="3023616"/>
             <wp:docPr id="4" name="Picture 4"/>
             <wp:cNvGraphicFramePr>
               <a:graphicFrameLocks noChangeAspect="1"/>
@@ -5749,7 +5749,7 @@
                   <pic:spPr>
                     <a:xfrm>
                       <a:off x="0" y="0"/>
-                      <a:ext cx="5669280" cy="3118104"/>
+                      <a:ext cx="5669280" cy="3023616"/>
                     </a:xfrm>
                     <a:prstGeom prst="rect"/>
                   </pic:spPr>
@@ -5870,7 +5870,7 @@
       <w:r>
         <w:drawing>
           <wp:inline xmlns:a="http://schemas.openxmlformats.org/drawingml/2006/main" xmlns:pic="http://schemas.openxmlformats.org/drawingml/2006/picture">
-            <wp:extent cx="5669280" cy="4475747"/>
+            <wp:extent cx="5669280" cy="4335332"/>
             <wp:docPr id="5" name="Picture 5"/>
             <wp:cNvGraphicFramePr>
               <a:graphicFrameLocks noChangeAspect="1"/>
@@ -5891,7 +5891,7 @@
                   <pic:spPr>
                     <a:xfrm>
                       <a:off x="0" y="0"/>
-                      <a:ext cx="5669280" cy="4475747"/>
+                      <a:ext cx="5669280" cy="4335332"/>
                     </a:xfrm>
                     <a:prstGeom prst="rect"/>
                   </pic:spPr>
@@ -6018,7 +6018,7 @@
       <w:r>
         <w:drawing>
           <wp:inline xmlns:a="http://schemas.openxmlformats.org/drawingml/2006/main" xmlns:pic="http://schemas.openxmlformats.org/drawingml/2006/picture">
-            <wp:extent cx="5669280" cy="3092335"/>
+            <wp:extent cx="5669280" cy="3103185"/>
             <wp:docPr id="6" name="Picture 6"/>
             <wp:cNvGraphicFramePr>
               <a:graphicFrameLocks noChangeAspect="1"/>
@@ -6039,7 +6039,7 @@
                   <pic:spPr>
                     <a:xfrm>
                       <a:off x="0" y="0"/>
-                      <a:ext cx="5669280" cy="3092335"/>
+                      <a:ext cx="5669280" cy="3103185"/>
                     </a:xfrm>
                     <a:prstGeom prst="rect"/>
                   </pic:spPr>
@@ -6164,7 +6164,7 @@
       <w:r>
         <w:drawing>
           <wp:inline xmlns:a="http://schemas.openxmlformats.org/drawingml/2006/main" xmlns:pic="http://schemas.openxmlformats.org/drawingml/2006/picture">
-            <wp:extent cx="5669280" cy="2834640"/>
+            <wp:extent cx="5669280" cy="2864478"/>
             <wp:docPr id="7" name="Picture 7"/>
             <wp:cNvGraphicFramePr>
               <a:graphicFrameLocks noChangeAspect="1"/>
@@ -6185,7 +6185,7 @@
                   <pic:spPr>
                     <a:xfrm>
                       <a:off x="0" y="0"/>
-                      <a:ext cx="5669280" cy="2834640"/>
+                      <a:ext cx="5669280" cy="2864478"/>
                     </a:xfrm>
                     <a:prstGeom prst="rect"/>
                   </pic:spPr>

</xml_diff>